<commit_message>
v1.13.10: Docs menu: the three training guides under Data Ingest; the three training guides link their videos
</commit_message>
<xml_diff>
--- a/docs/training-caais-accessions.docx
+++ b/docs/training-caais-accessions.docx
@@ -503,7 +503,18 @@
         <w:pStyle w:val="BodyText"/>
       </w:pPr>
       <w:r>
-        <w:t xml:space="preserve">This guide goes with the training video of the same name. CAAIS, the Canadian Archival Accession Information Standard, version 1.0, defines what an accession record should hold. With the CAAIS profile switched on, AtoM’s accession form gains a CAAIS section, the accession page checks the mandatory elements, and each record exports as CAAIS in JSON, CSV or XML.</w:t>
+        <w:t xml:space="preserve">This guide goes with the training video of the same name (</w:t>
+      </w:r>
+      <w:hyperlink r:id="rId20">
+        <w:r>
+          <w:rPr>
+            <w:rStyle w:val="Hyperlink"/>
+          </w:rPr>
+          <w:t xml:space="preserve">watch on YouTube</w:t>
+        </w:r>
+      </w:hyperlink>
+      <w:r>
+        <w:t xml:space="preserve">). CAAIS, the Canadian Archival Accession Information Standard, version 1.0, defines what an accession record should hold. With the CAAIS profile switched on, AtoM’s accession form gains a CAAIS section, the accession page checks the mandatory elements, and each record exports as CAAIS in JSON, CSV or XML.</w:t>
       </w:r>
     </w:p>
     <w:p>
@@ -514,7 +525,7 @@
         <w:t xml:space="preserve">You will switch CAAIS on, record an accession, find and fix a missing mandatory element, and export the result. Allow about 15 minutes.</w:t>
       </w:r>
     </w:p>
-    <w:bookmarkStart w:id="20" w:name="before-you-start"/>
+    <w:bookmarkStart w:id="21" w:name="before-you-start"/>
     <w:p>
       <w:pPr>
         <w:pStyle w:val="Heading2"/>
@@ -651,8 +662,8 @@
         <w:t xml:space="preserve">at the end.</w:t>
       </w:r>
     </w:p>
-    <w:bookmarkEnd w:id="20"/>
-    <w:bookmarkStart w:id="24" w:name="switch-caais-on-administrator-once"/>
+    <w:bookmarkEnd w:id="21"/>
+    <w:bookmarkStart w:id="25" w:name="switch-caais-on-administrator-once"/>
     <w:p>
       <w:pPr>
         <w:pStyle w:val="Heading2"/>
@@ -780,18 +791,18 @@
           <wp:inline>
             <wp:extent cx="5778500" cy="3250406"/>
             <wp:effectExtent b="0" l="0" r="0" t="0"/>
-            <wp:docPr descr="AHG Settings &gt; Accession Management, with the CAAIS 1.0 accession profile switched on." title="" id="22" name="Picture"/>
+            <wp:docPr descr="AHG Settings &gt; Accession Management, with the CAAIS 1.0 accession profile switched on." title="" id="23" name="Picture"/>
             <a:graphic>
               <a:graphicData uri="http://schemas.openxmlformats.org/drawingml/2006/picture">
                 <pic:pic>
                   <pic:nvPicPr>
-                    <pic:cNvPr descr="images/training-caais/01-switch.png" id="23" name="Picture"/>
+                    <pic:cNvPr descr="images/training-caais/01-switch.png" id="24" name="Picture"/>
                     <pic:cNvPicPr>
                       <a:picLocks noChangeArrowheads="1" noChangeAspect="1"/>
                     </pic:cNvPicPr>
                   </pic:nvPicPr>
                   <pic:blipFill>
-                    <a:blip r:embed="rId21"/>
+                    <a:blip r:embed="rId22"/>
                     <a:stretch>
                       <a:fillRect/>
                     </a:stretch>
@@ -834,8 +845,8 @@
         <w:t xml:space="preserve">Switching it off later hides the CAAIS section again; everything already recorded is kept.</w:t>
       </w:r>
     </w:p>
-    <w:bookmarkEnd w:id="24"/>
-    <w:bookmarkStart w:id="40" w:name="record-the-accession"/>
+    <w:bookmarkEnd w:id="25"/>
+    <w:bookmarkStart w:id="41" w:name="record-the-accession"/>
     <w:p>
       <w:pPr>
         <w:pStyle w:val="Heading2"/>
@@ -970,18 +981,18 @@
           <wp:inline>
             <wp:extent cx="5778500" cy="3250406"/>
             <wp:effectExtent b="0" l="0" r="0" t="0"/>
-            <wp:docPr descr="Basic info: accession number, acquisition date, source and location." title="" id="26" name="Picture"/>
+            <wp:docPr descr="Basic info: accession number, acquisition date, source and location." title="" id="27" name="Picture"/>
             <a:graphic>
               <a:graphicData uri="http://schemas.openxmlformats.org/drawingml/2006/picture">
                 <pic:pic>
                   <pic:nvPicPr>
-                    <pic:cNvPr descr="images/training-caais/02-basic.png" id="27" name="Picture"/>
+                    <pic:cNvPr descr="images/training-caais/02-basic.png" id="28" name="Picture"/>
                     <pic:cNvPicPr>
                       <a:picLocks noChangeArrowheads="1" noChangeAspect="1"/>
                     </pic:cNvPicPr>
                   </pic:nvPicPr>
                   <pic:blipFill>
-                    <a:blip r:embed="rId25"/>
+                    <a:blip r:embed="rId26"/>
                     <a:stretch>
                       <a:fillRect/>
                     </a:stretch>
@@ -1102,18 +1113,18 @@
           <wp:inline>
             <wp:extent cx="5778500" cy="3250406"/>
             <wp:effectExtent b="0" l="0" r="0" t="0"/>
-            <wp:docPr descr="Date(s): display date, start and end." title="" id="29" name="Picture"/>
+            <wp:docPr descr="Date(s): display date, start and end." title="" id="30" name="Picture"/>
             <a:graphic>
               <a:graphicData uri="http://schemas.openxmlformats.org/drawingml/2006/picture">
                 <pic:pic>
                   <pic:nvPicPr>
-                    <pic:cNvPr descr="images/training-caais/03-dates.png" id="30" name="Picture"/>
+                    <pic:cNvPr descr="images/training-caais/03-dates.png" id="31" name="Picture"/>
                     <pic:cNvPicPr>
                       <a:picLocks noChangeArrowheads="1" noChangeAspect="1"/>
                     </pic:cNvPicPr>
                   </pic:nvPicPr>
                   <pic:blipFill>
-                    <a:blip r:embed="rId28"/>
+                    <a:blip r:embed="rId29"/>
                     <a:stretch>
                       <a:fillRect/>
                     </a:stretch>
@@ -1213,18 +1224,18 @@
           <wp:inline>
             <wp:extent cx="5778500" cy="3250406"/>
             <wp:effectExtent b="0" l="0" r="0" t="0"/>
-            <wp:docPr descr="The CAAIS section opened, with the repository and rules." title="" id="32" name="Picture"/>
+            <wp:docPr descr="The CAAIS section opened, with the repository and rules." title="" id="33" name="Picture"/>
             <a:graphic>
               <a:graphicData uri="http://schemas.openxmlformats.org/drawingml/2006/picture">
                 <pic:pic>
                   <pic:nvPicPr>
-                    <pic:cNvPr descr="images/training-caais/04-caais-open.png" id="33" name="Picture"/>
+                    <pic:cNvPr descr="images/training-caais/04-caais-open.png" id="34" name="Picture"/>
                     <pic:cNvPicPr>
                       <a:picLocks noChangeArrowheads="1" noChangeAspect="1"/>
                     </pic:cNvPicPr>
                   </pic:nvPicPr>
                   <pic:blipFill>
-                    <a:blip r:embed="rId31"/>
+                    <a:blip r:embed="rId32"/>
                     <a:stretch>
                       <a:fillRect/>
                     </a:stretch>
@@ -1286,18 +1297,18 @@
           <wp:inline>
             <wp:extent cx="5778500" cy="3250406"/>
             <wp:effectExtent b="0" l="0" r="0" t="0"/>
-            <wp:docPr descr="An extent statement: two boxes of textual records on paper." title="" id="35" name="Picture"/>
+            <wp:docPr descr="An extent statement: two boxes of textual records on paper." title="" id="36" name="Picture"/>
             <a:graphic>
               <a:graphicData uri="http://schemas.openxmlformats.org/drawingml/2006/picture">
                 <pic:pic>
                   <pic:nvPicPr>
-                    <pic:cNvPr descr="images/training-caais/05-extent.png" id="36" name="Picture"/>
+                    <pic:cNvPr descr="images/training-caais/05-extent.png" id="37" name="Picture"/>
                     <pic:cNvPicPr>
                       <a:picLocks noChangeArrowheads="1" noChangeAspect="1"/>
                     </pic:cNvPicPr>
                   </pic:nvPicPr>
                   <pic:blipFill>
-                    <a:blip r:embed="rId34"/>
+                    <a:blip r:embed="rId35"/>
                     <a:stretch>
                       <a:fillRect/>
                     </a:stretch>
@@ -1455,18 +1466,18 @@
           <wp:inline>
             <wp:extent cx="5778500" cy="3250406"/>
             <wp:effectExtent b="0" l="0" r="0" t="0"/>
-            <wp:docPr descr="The legal transfer filled in; the physical transfer left empty on purpose." title="" id="38" name="Picture"/>
+            <wp:docPr descr="The legal transfer filled in; the physical transfer left empty on purpose." title="" id="39" name="Picture"/>
             <a:graphic>
               <a:graphicData uri="http://schemas.openxmlformats.org/drawingml/2006/picture">
                 <pic:pic>
                   <pic:nvPicPr>
-                    <pic:cNvPr descr="images/training-caais/06-events.png" id="39" name="Picture"/>
+                    <pic:cNvPr descr="images/training-caais/06-events.png" id="40" name="Picture"/>
                     <pic:cNvPicPr>
                       <a:picLocks noChangeArrowheads="1" noChangeAspect="1"/>
                     </pic:cNvPicPr>
                   </pic:nvPicPr>
                   <pic:blipFill>
-                    <a:blip r:embed="rId37"/>
+                    <a:blip r:embed="rId38"/>
                     <a:stretch>
                       <a:fillRect/>
                     </a:stretch>
@@ -1522,8 +1533,8 @@
         <w:t xml:space="preserve">. The accession page opens.</w:t>
       </w:r>
     </w:p>
-    <w:bookmarkEnd w:id="40"/>
-    <w:bookmarkStart w:id="50" w:name="check-and-fix"/>
+    <w:bookmarkEnd w:id="41"/>
+    <w:bookmarkStart w:id="51" w:name="check-and-fix"/>
     <w:p>
       <w:pPr>
         <w:pStyle w:val="Heading2"/>
@@ -1564,18 +1575,18 @@
           <wp:inline>
             <wp:extent cx="5778500" cy="3250406"/>
             <wp:effectExtent b="0" l="0" r="0" t="0"/>
-            <wp:docPr descr="CAAIS mandatory elements not yet recorded: 5.1 - Event: physical transfer." title="" id="42" name="Picture"/>
+            <wp:docPr descr="CAAIS mandatory elements not yet recorded: 5.1 - Event: physical transfer." title="" id="43" name="Picture"/>
             <a:graphic>
               <a:graphicData uri="http://schemas.openxmlformats.org/drawingml/2006/picture">
                 <pic:pic>
                   <pic:nvPicPr>
-                    <pic:cNvPr descr="images/training-caais/07-warning.png" id="43" name="Picture"/>
+                    <pic:cNvPr descr="images/training-caais/07-warning.png" id="44" name="Picture"/>
                     <pic:cNvPicPr>
                       <a:picLocks noChangeArrowheads="1" noChangeAspect="1"/>
                     </pic:cNvPicPr>
                   </pic:nvPicPr>
                   <pic:blipFill>
-                    <a:blip r:embed="rId41"/>
+                    <a:blip r:embed="rId42"/>
                     <a:stretch>
                       <a:fillRect/>
                     </a:stretch>
@@ -1708,18 +1719,18 @@
           <wp:inline>
             <wp:extent cx="5778500" cy="3250406"/>
             <wp:effectExtent b="0" l="0" r="0" t="0"/>
-            <wp:docPr descr="The physical transfer row completed on the edit form." title="" id="45" name="Picture"/>
+            <wp:docPr descr="The physical transfer row completed on the edit form." title="" id="46" name="Picture"/>
             <a:graphic>
               <a:graphicData uri="http://schemas.openxmlformats.org/drawingml/2006/picture">
                 <pic:pic>
                   <pic:nvPicPr>
-                    <pic:cNvPr descr="images/training-caais/08-fix.png" id="46" name="Picture"/>
+                    <pic:cNvPr descr="images/training-caais/08-fix.png" id="47" name="Picture"/>
                     <pic:cNvPicPr>
                       <a:picLocks noChangeArrowheads="1" noChangeAspect="1"/>
                     </pic:cNvPicPr>
                   </pic:nvPicPr>
                   <pic:blipFill>
-                    <a:blip r:embed="rId44"/>
+                    <a:blip r:embed="rId45"/>
                     <a:stretch>
                       <a:fillRect/>
                     </a:stretch>
@@ -1789,18 +1800,18 @@
           <wp:inline>
             <wp:extent cx="5778500" cy="3250406"/>
             <wp:effectExtent b="0" l="0" r="0" t="0"/>
-            <wp:docPr descr="The CAAIS area with no warnings, both events and the revision history." title="" id="48" name="Picture"/>
+            <wp:docPr descr="The CAAIS area with no warnings, both events and the revision history." title="" id="49" name="Picture"/>
             <a:graphic>
               <a:graphicData uri="http://schemas.openxmlformats.org/drawingml/2006/picture">
                 <pic:pic>
                   <pic:nvPicPr>
-                    <pic:cNvPr descr="images/training-caais/09-fixed.png" id="49" name="Picture"/>
+                    <pic:cNvPr descr="images/training-caais/09-fixed.png" id="50" name="Picture"/>
                     <pic:cNvPicPr>
                       <a:picLocks noChangeArrowheads="1" noChangeAspect="1"/>
                     </pic:cNvPicPr>
                   </pic:nvPicPr>
                   <pic:blipFill>
-                    <a:blip r:embed="rId47"/>
+                    <a:blip r:embed="rId48"/>
                     <a:stretch>
                       <a:fillRect/>
                     </a:stretch>
@@ -2134,8 +2145,8 @@
         </w:tc>
       </w:tr>
     </w:tbl>
-    <w:bookmarkEnd w:id="50"/>
-    <w:bookmarkStart w:id="60" w:name="export"/>
+    <w:bookmarkEnd w:id="51"/>
+    <w:bookmarkStart w:id="61" w:name="export"/>
     <w:p>
       <w:pPr>
         <w:pStyle w:val="Heading2"/>
@@ -2247,18 +2258,18 @@
           <wp:inline>
             <wp:extent cx="5778500" cy="3250406"/>
             <wp:effectExtent b="0" l="0" r="0" t="0"/>
-            <wp:docPr descr="The CAAIS export links on the accession page." title="" id="52" name="Picture"/>
+            <wp:docPr descr="The CAAIS export links on the accession page." title="" id="53" name="Picture"/>
             <a:graphic>
               <a:graphicData uri="http://schemas.openxmlformats.org/drawingml/2006/picture">
                 <pic:pic>
                   <pic:nvPicPr>
-                    <pic:cNvPr descr="images/training-caais/10-export-links.png" id="53" name="Picture"/>
+                    <pic:cNvPr descr="images/training-caais/10-export-links.png" id="54" name="Picture"/>
                     <pic:cNvPicPr>
                       <a:picLocks noChangeArrowheads="1" noChangeAspect="1"/>
                     </pic:cNvPicPr>
                   </pic:nvPicPr>
                   <pic:blipFill>
-                    <a:blip r:embed="rId51"/>
+                    <a:blip r:embed="rId52"/>
                     <a:stretch>
                       <a:fillRect/>
                     </a:stretch>
@@ -2310,18 +2321,18 @@
           <wp:inline>
             <wp:extent cx="5778500" cy="3250406"/>
             <wp:effectExtent b="0" l="0" r="0" t="0"/>
-            <wp:docPr descr="The XML export, with its crosswalk." title="" id="55" name="Picture"/>
+            <wp:docPr descr="The XML export, with its crosswalk." title="" id="56" name="Picture"/>
             <a:graphic>
               <a:graphicData uri="http://schemas.openxmlformats.org/drawingml/2006/picture">
                 <pic:pic>
                   <pic:nvPicPr>
-                    <pic:cNvPr descr="images/training-caais/11-export-xml.png" id="56" name="Picture"/>
+                    <pic:cNvPr descr="images/training-caais/11-export-xml.png" id="57" name="Picture"/>
                     <pic:cNvPicPr>
                       <a:picLocks noChangeArrowheads="1" noChangeAspect="1"/>
                     </pic:cNvPicPr>
                   </pic:nvPicPr>
                   <pic:blipFill>
-                    <a:blip r:embed="rId54"/>
+                    <a:blip r:embed="rId55"/>
                     <a:stretch>
                       <a:fillRect/>
                     </a:stretch>
@@ -2407,18 +2418,18 @@
           <wp:inline>
             <wp:extent cx="5778500" cy="3250406"/>
             <wp:effectExtent b="0" l="0" r="0" t="0"/>
-            <wp:docPr descr="Bulk export from the accession list." title="" id="58" name="Picture"/>
+            <wp:docPr descr="Bulk export from the accession list." title="" id="59" name="Picture"/>
             <a:graphic>
               <a:graphicData uri="http://schemas.openxmlformats.org/drawingml/2006/picture">
                 <pic:pic>
                   <pic:nvPicPr>
-                    <pic:cNvPr descr="images/training-caais/12-bulk.png" id="59" name="Picture"/>
+                    <pic:cNvPr descr="images/training-caais/12-bulk.png" id="60" name="Picture"/>
                     <pic:cNvPicPr>
                       <a:picLocks noChangeArrowheads="1" noChangeAspect="1"/>
                     </pic:cNvPicPr>
                   </pic:nvPicPr>
                   <pic:blipFill>
-                    <a:blip r:embed="rId57"/>
+                    <a:blip r:embed="rId58"/>
                     <a:stretch>
                       <a:fillRect/>
                     </a:stretch>
@@ -2453,8 +2464,8 @@
         <w:t xml:space="preserve">Bulk export from the accession list.</w:t>
       </w:r>
     </w:p>
-    <w:bookmarkEnd w:id="60"/>
-    <w:bookmarkStart w:id="61" w:name="recap"/>
+    <w:bookmarkEnd w:id="61"/>
+    <w:bookmarkStart w:id="62" w:name="recap"/>
     <w:p>
       <w:pPr>
         <w:pStyle w:val="Heading2"/>
@@ -2535,8 +2546,8 @@
         <w:t xml:space="preserve">Export as JSON, CSV or XML, full or for sharing.</w:t>
       </w:r>
     </w:p>
-    <w:bookmarkEnd w:id="61"/>
-    <w:bookmarkStart w:id="62" w:name="cleaning-up"/>
+    <w:bookmarkEnd w:id="62"/>
+    <w:bookmarkStart w:id="63" w:name="cleaning-up"/>
     <w:p>
       <w:pPr>
         <w:pStyle w:val="Heading2"/>
@@ -2566,7 +2577,7 @@
         <w:t xml:space="preserve">.</w:t>
       </w:r>
     </w:p>
-    <w:bookmarkEnd w:id="62"/>
+    <w:bookmarkEnd w:id="63"/>
     <w:sectPr>
       <w:headerReference r:id="rId9" w:type="default"/>
       <w:footerReference r:id="rId10" w:type="default"/>

</xml_diff>